<commit_message>
docs: registra cierre y evidencias del Sprint 02
</commit_message>
<xml_diff>
--- a/FASE 2/Evidencias Proyecto/Documentacion/Registro de errores.docx
+++ b/FASE 2/Evidencias Proyecto/Documentacion/Registro de errores.docx
@@ -200,11 +200,41 @@
           <w:rFonts w:ascii="Calibri" w:hAnsi="Calibri" w:cs="Calibri"/>
         </w:rPr>
         <w:t>Integrantes: Alejandro Silva</w:t>
+      </w:r>
+      <w:r>
+        <w:rPr>
+          <w:rFonts w:ascii="Calibri" w:hAnsi="Calibri" w:cs="Calibri"/>
+        </w:rPr>
         <w:tab/>
+      </w:r>
+      <w:r>
+        <w:rPr>
+          <w:rFonts w:ascii="Calibri" w:hAnsi="Calibri" w:cs="Calibri"/>
+        </w:rPr>
         <w:tab/>
+      </w:r>
+      <w:r>
+        <w:rPr>
+          <w:rFonts w:ascii="Calibri" w:hAnsi="Calibri" w:cs="Calibri"/>
+        </w:rPr>
         <w:tab/>
+      </w:r>
+      <w:r>
+        <w:rPr>
+          <w:rFonts w:ascii="Calibri" w:hAnsi="Calibri" w:cs="Calibri"/>
+        </w:rPr>
         <w:tab/>
+      </w:r>
+      <w:r>
+        <w:rPr>
+          <w:rFonts w:ascii="Calibri" w:hAnsi="Calibri" w:cs="Calibri"/>
+        </w:rPr>
         <w:tab/>
+      </w:r>
+      <w:r>
+        <w:rPr>
+          <w:rFonts w:ascii="Calibri" w:hAnsi="Calibri" w:cs="Calibri"/>
+        </w:rPr>
         <w:tab/>
         <w:t>Docente: Maria Cobo</w:t>
       </w:r>
@@ -289,10 +319,14 @@
           </w:pPr>
           <w:r>
             <w:fldChar w:fldCharType="begin"/>
+          </w:r>
+          <w:r>
             <w:instrText xml:space="preserve"> TOC \o "1-3" \h \z \u </w:instrText>
+          </w:r>
+          <w:r>
             <w:fldChar w:fldCharType="separate"/>
           </w:r>
-          <w:hyperlink w:anchor="_Toc9209101" w:history="1">
+          <w:hyperlink w:anchor="_Toc242959511" w:history="1">
             <w:r>
               <w:rPr>
                 <w:rStyle w:val="Hipervnculo"/>
@@ -307,10 +341,46 @@
                 <w:webHidden/>
               </w:rPr>
               <w:tab/>
+            </w:r>
+            <w:r>
+              <w:rPr>
+                <w:noProof/>
+                <w:webHidden/>
+              </w:rPr>
               <w:fldChar w:fldCharType="begin"/>
-              <w:instrText xml:space="preserve"> PAGEREF _Toc9209101 \h </w:instrText>
+            </w:r>
+            <w:r>
+              <w:rPr>
+                <w:noProof/>
+                <w:webHidden/>
+              </w:rPr>
+              <w:instrText xml:space="preserve"> PAGEREF _Toc242959511 \h </w:instrText>
+            </w:r>
+            <w:r>
+              <w:rPr>
+                <w:noProof/>
+                <w:webHidden/>
+              </w:rPr>
+            </w:r>
+            <w:r>
+              <w:rPr>
+                <w:noProof/>
+                <w:webHidden/>
+              </w:rPr>
               <w:fldChar w:fldCharType="separate"/>
+            </w:r>
+            <w:r>
+              <w:rPr>
+                <w:noProof/>
+                <w:webHidden/>
+              </w:rPr>
               <w:t>3</w:t>
+            </w:r>
+            <w:r>
+              <w:rPr>
+                <w:noProof/>
+                <w:webHidden/>
+              </w:rPr>
               <w:fldChar w:fldCharType="end"/>
             </w:r>
           </w:hyperlink>
@@ -327,7 +397,7 @@
               <w:lang w:eastAsia="es-CL"/>
             </w:rPr>
           </w:pPr>
-          <w:hyperlink w:anchor="_Toc9209102" w:history="1">
+          <w:hyperlink w:anchor="_Toc242959512" w:history="1">
             <w:r>
               <w:rPr>
                 <w:rStyle w:val="Hipervnculo"/>
@@ -342,10 +412,46 @@
                 <w:webHidden/>
               </w:rPr>
               <w:tab/>
+            </w:r>
+            <w:r>
+              <w:rPr>
+                <w:noProof/>
+                <w:webHidden/>
+              </w:rPr>
               <w:fldChar w:fldCharType="begin"/>
-              <w:instrText xml:space="preserve"> PAGEREF _Toc9209102 \h </w:instrText>
+            </w:r>
+            <w:r>
+              <w:rPr>
+                <w:noProof/>
+                <w:webHidden/>
+              </w:rPr>
+              <w:instrText xml:space="preserve"> PAGEREF _Toc242959512 \h </w:instrText>
+            </w:r>
+            <w:r>
+              <w:rPr>
+                <w:noProof/>
+                <w:webHidden/>
+              </w:rPr>
+            </w:r>
+            <w:r>
+              <w:rPr>
+                <w:noProof/>
+                <w:webHidden/>
+              </w:rPr>
               <w:fldChar w:fldCharType="separate"/>
+            </w:r>
+            <w:r>
+              <w:rPr>
+                <w:noProof/>
+                <w:webHidden/>
+              </w:rPr>
               <w:t>3</w:t>
+            </w:r>
+            <w:r>
+              <w:rPr>
+                <w:noProof/>
+                <w:webHidden/>
+              </w:rPr>
               <w:fldChar w:fldCharType="end"/>
             </w:r>
           </w:hyperlink>
@@ -362,7 +468,7 @@
               <w:lang w:eastAsia="es-CL"/>
             </w:rPr>
           </w:pPr>
-          <w:hyperlink w:anchor="_Toc9209103" w:history="1">
+          <w:hyperlink w:anchor="_Toc242959513" w:history="1">
             <w:r>
               <w:rPr>
                 <w:rStyle w:val="Hipervnculo"/>
@@ -377,10 +483,46 @@
                 <w:webHidden/>
               </w:rPr>
               <w:tab/>
+            </w:r>
+            <w:r>
+              <w:rPr>
+                <w:noProof/>
+                <w:webHidden/>
+              </w:rPr>
               <w:fldChar w:fldCharType="begin"/>
-              <w:instrText xml:space="preserve"> PAGEREF _Toc9209103 \h </w:instrText>
+            </w:r>
+            <w:r>
+              <w:rPr>
+                <w:noProof/>
+                <w:webHidden/>
+              </w:rPr>
+              <w:instrText xml:space="preserve"> PAGEREF _Toc242959513 \h </w:instrText>
+            </w:r>
+            <w:r>
+              <w:rPr>
+                <w:noProof/>
+                <w:webHidden/>
+              </w:rPr>
+            </w:r>
+            <w:r>
+              <w:rPr>
+                <w:noProof/>
+                <w:webHidden/>
+              </w:rPr>
               <w:fldChar w:fldCharType="separate"/>
+            </w:r>
+            <w:r>
+              <w:rPr>
+                <w:noProof/>
+                <w:webHidden/>
+              </w:rPr>
               <w:t>3</w:t>
+            </w:r>
+            <w:r>
+              <w:rPr>
+                <w:noProof/>
+                <w:webHidden/>
+              </w:rPr>
               <w:fldChar w:fldCharType="end"/>
             </w:r>
           </w:hyperlink>
@@ -397,7 +539,7 @@
               <w:lang w:eastAsia="es-CL"/>
             </w:rPr>
           </w:pPr>
-          <w:hyperlink w:anchor="_Toc9209104" w:history="1">
+          <w:hyperlink w:anchor="_Toc242959514" w:history="1">
             <w:r>
               <w:rPr>
                 <w:rStyle w:val="Hipervnculo"/>
@@ -412,10 +554,46 @@
                 <w:webHidden/>
               </w:rPr>
               <w:tab/>
+            </w:r>
+            <w:r>
+              <w:rPr>
+                <w:noProof/>
+                <w:webHidden/>
+              </w:rPr>
               <w:fldChar w:fldCharType="begin"/>
-              <w:instrText xml:space="preserve"> PAGEREF _Toc9209104 \h </w:instrText>
+            </w:r>
+            <w:r>
+              <w:rPr>
+                <w:noProof/>
+                <w:webHidden/>
+              </w:rPr>
+              <w:instrText xml:space="preserve"> PAGEREF _Toc242959514 \h </w:instrText>
+            </w:r>
+            <w:r>
+              <w:rPr>
+                <w:noProof/>
+                <w:webHidden/>
+              </w:rPr>
+            </w:r>
+            <w:r>
+              <w:rPr>
+                <w:noProof/>
+                <w:webHidden/>
+              </w:rPr>
               <w:fldChar w:fldCharType="separate"/>
+            </w:r>
+            <w:r>
+              <w:rPr>
+                <w:noProof/>
+                <w:webHidden/>
+              </w:rPr>
               <w:t>4</w:t>
+            </w:r>
+            <w:r>
+              <w:rPr>
+                <w:noProof/>
+                <w:webHidden/>
+              </w:rPr>
               <w:fldChar w:fldCharType="end"/>
             </w:r>
           </w:hyperlink>
@@ -432,7 +610,7 @@
               <w:lang w:eastAsia="es-CL"/>
             </w:rPr>
           </w:pPr>
-          <w:hyperlink w:anchor="_Toc9209105" w:history="1">
+          <w:hyperlink w:anchor="_Toc242959515" w:history="1">
             <w:r>
               <w:rPr>
                 <w:rStyle w:val="Hipervnculo"/>
@@ -447,10 +625,46 @@
                 <w:webHidden/>
               </w:rPr>
               <w:tab/>
+            </w:r>
+            <w:r>
+              <w:rPr>
+                <w:noProof/>
+                <w:webHidden/>
+              </w:rPr>
               <w:fldChar w:fldCharType="begin"/>
-              <w:instrText xml:space="preserve"> PAGEREF _Toc9209105 \h </w:instrText>
+            </w:r>
+            <w:r>
+              <w:rPr>
+                <w:noProof/>
+                <w:webHidden/>
+              </w:rPr>
+              <w:instrText xml:space="preserve"> PAGEREF _Toc242959515 \h </w:instrText>
+            </w:r>
+            <w:r>
+              <w:rPr>
+                <w:noProof/>
+                <w:webHidden/>
+              </w:rPr>
+            </w:r>
+            <w:r>
+              <w:rPr>
+                <w:noProof/>
+                <w:webHidden/>
+              </w:rPr>
               <w:fldChar w:fldCharType="separate"/>
+            </w:r>
+            <w:r>
+              <w:rPr>
+                <w:noProof/>
+                <w:webHidden/>
+              </w:rPr>
               <w:t>4</w:t>
+            </w:r>
+            <w:r>
+              <w:rPr>
+                <w:noProof/>
+                <w:webHidden/>
+              </w:rPr>
               <w:fldChar w:fldCharType="end"/>
             </w:r>
           </w:hyperlink>
@@ -467,7 +681,7 @@
               <w:lang w:eastAsia="es-CL"/>
             </w:rPr>
           </w:pPr>
-          <w:hyperlink w:anchor="_Toc9209106" w:history="1">
+          <w:hyperlink w:anchor="_Toc242959516" w:history="1">
             <w:r>
               <w:rPr>
                 <w:rStyle w:val="Hipervnculo"/>
@@ -482,10 +696,46 @@
                 <w:webHidden/>
               </w:rPr>
               <w:tab/>
+            </w:r>
+            <w:r>
+              <w:rPr>
+                <w:noProof/>
+                <w:webHidden/>
+              </w:rPr>
               <w:fldChar w:fldCharType="begin"/>
-              <w:instrText xml:space="preserve"> PAGEREF _Toc9209106 \h </w:instrText>
+            </w:r>
+            <w:r>
+              <w:rPr>
+                <w:noProof/>
+                <w:webHidden/>
+              </w:rPr>
+              <w:instrText xml:space="preserve"> PAGEREF _Toc242959516 \h </w:instrText>
+            </w:r>
+            <w:r>
+              <w:rPr>
+                <w:noProof/>
+                <w:webHidden/>
+              </w:rPr>
+            </w:r>
+            <w:r>
+              <w:rPr>
+                <w:noProof/>
+                <w:webHidden/>
+              </w:rPr>
               <w:fldChar w:fldCharType="separate"/>
+            </w:r>
+            <w:r>
+              <w:rPr>
+                <w:noProof/>
+                <w:webHidden/>
+              </w:rPr>
               <w:t>4</w:t>
+            </w:r>
+            <w:r>
+              <w:rPr>
+                <w:noProof/>
+                <w:webHidden/>
+              </w:rPr>
               <w:fldChar w:fldCharType="end"/>
             </w:r>
           </w:hyperlink>
@@ -502,7 +752,7 @@
               <w:lang w:eastAsia="es-CL"/>
             </w:rPr>
           </w:pPr>
-          <w:hyperlink w:anchor="_Toc9209107" w:history="1">
+          <w:hyperlink w:anchor="_Toc242959517" w:history="1">
             <w:r>
               <w:rPr>
                 <w:rStyle w:val="Hipervnculo"/>
@@ -517,10 +767,46 @@
                 <w:webHidden/>
               </w:rPr>
               <w:tab/>
+            </w:r>
+            <w:r>
+              <w:rPr>
+                <w:noProof/>
+                <w:webHidden/>
+              </w:rPr>
               <w:fldChar w:fldCharType="begin"/>
-              <w:instrText xml:space="preserve"> PAGEREF _Toc9209107 \h </w:instrText>
+            </w:r>
+            <w:r>
+              <w:rPr>
+                <w:noProof/>
+                <w:webHidden/>
+              </w:rPr>
+              <w:instrText xml:space="preserve"> PAGEREF _Toc242959517 \h </w:instrText>
+            </w:r>
+            <w:r>
+              <w:rPr>
+                <w:noProof/>
+                <w:webHidden/>
+              </w:rPr>
+            </w:r>
+            <w:r>
+              <w:rPr>
+                <w:noProof/>
+                <w:webHidden/>
+              </w:rPr>
               <w:fldChar w:fldCharType="separate"/>
+            </w:r>
+            <w:r>
+              <w:rPr>
+                <w:noProof/>
+                <w:webHidden/>
+              </w:rPr>
               <w:t>4</w:t>
+            </w:r>
+            <w:r>
+              <w:rPr>
+                <w:noProof/>
+                <w:webHidden/>
+              </w:rPr>
               <w:fldChar w:fldCharType="end"/>
             </w:r>
           </w:hyperlink>
@@ -548,7 +834,7 @@
           <w:rFonts w:ascii="Calibri" w:hAnsi="Calibri" w:cs="Calibri"/>
         </w:rPr>
       </w:pPr>
-      <w:bookmarkStart w:id="0" w:name="_Toc9209101"/>
+      <w:bookmarkStart w:id="0" w:name="_Toc242959511"/>
       <w:r>
         <w:rPr>
           <w:rFonts w:ascii="Calibri" w:hAnsi="Calibri" w:cs="Calibri"/>
@@ -594,7 +880,7 @@
           <w:rFonts w:ascii="Calibri" w:hAnsi="Calibri" w:cs="Calibri"/>
         </w:rPr>
       </w:pPr>
-      <w:bookmarkStart w:id="1" w:name="_Toc9209102"/>
+      <w:bookmarkStart w:id="1" w:name="_Toc242959512"/>
       <w:r>
         <w:rPr>
           <w:rFonts w:ascii="Calibri" w:hAnsi="Calibri" w:cs="Calibri"/>
@@ -753,7 +1039,7 @@
           <w:rFonts w:ascii="Calibri" w:hAnsi="Calibri" w:cs="Calibri"/>
         </w:rPr>
       </w:pPr>
-      <w:bookmarkStart w:id="2" w:name="_Toc9209103"/>
+      <w:bookmarkStart w:id="2" w:name="_Toc242959513"/>
       <w:r>
         <w:rPr>
           <w:rFonts w:ascii="Calibri" w:hAnsi="Calibri" w:cs="Calibri"/>
@@ -1195,11 +1481,12 @@
           <w:rFonts w:ascii="Calibri" w:hAnsi="Calibri" w:cs="Calibri"/>
         </w:rPr>
       </w:pPr>
-      <w:bookmarkStart w:id="3" w:name="_Toc9209104"/>
+      <w:bookmarkStart w:id="3" w:name="_Toc242959514"/>
       <w:r>
         <w:rPr>
           <w:rFonts w:ascii="Calibri" w:hAnsi="Calibri" w:cs="Calibri"/>
         </w:rPr>
+        <w:lastRenderedPageBreak/>
         <w:t>4. Estados de un error</w:t>
       </w:r>
       <w:bookmarkEnd w:id="3"/>
@@ -1566,7 +1853,7 @@
           <w:rFonts w:ascii="Calibri" w:hAnsi="Calibri" w:cs="Calibri"/>
         </w:rPr>
       </w:pPr>
-      <w:bookmarkStart w:id="4" w:name="_Toc9209105"/>
+      <w:bookmarkStart w:id="4" w:name="_Toc242959515"/>
       <w:r>
         <w:rPr>
           <w:rFonts w:ascii="Calibri" w:hAnsi="Calibri" w:cs="Calibri"/>
@@ -1577,6 +1864,7 @@
     </w:p>
     <w:p>
       <w:pPr>
+        <w:spacing w:after="0"/>
         <w:jc w:val="both"/>
         <w:rPr>
           <w:rFonts w:ascii="Calibri" w:hAnsi="Calibri" w:cs="Calibri"/>
@@ -1586,11 +1874,10 @@
       </w:pPr>
       <w:r>
         <w:rPr>
-          <w:rFonts w:ascii="Calibri" w:hAnsi="Calibri" w:cs="Calibri"/>
+          <w:rFonts w:ascii="Calibri" w:hAnsi="Calibri"/>
           <w:sz w:val="22"/>
-          <w:szCs w:val="22"/>
-        </w:rPr>
-        <w:t>Los errores se registran en la siguiente tabla, en orden de detección. Durante el Sprint 01 no se detectaron errores en las pruebas automatizadas ni en las pruebas manuales del incremento, por lo que la tabla no contiene registros de ese Sprint.</w:t>
+        </w:rPr>
+        <w:t>Los errores se registran en la siguiente tabla, en orden de detección. Durante el Sprint 01 no se detectaron errores. En el Sprint 02 se detectaron dos errores de integración; ambos fueron corregidos y verificados antes del cierre.</w:t>
       </w:r>
     </w:p>
     <w:tbl>
@@ -1783,6 +2070,214 @@
           </w:p>
         </w:tc>
       </w:tr>
+      <w:tr>
+        <w:tc>
+          <w:tcPr>
+            <w:tcW w:w="900" w:type="dxa"/>
+          </w:tcPr>
+          <w:p>
+            <w:pPr>
+              <w:spacing w:after="0"/>
+            </w:pPr>
+            <w:r>
+              <w:rPr>
+                <w:rFonts w:ascii="Calibri" w:hAnsi="Calibri"/>
+                <w:sz w:val="16"/>
+              </w:rPr>
+              <w:t>ERR-001</w:t>
+            </w:r>
+          </w:p>
+        </w:tc>
+        <w:tc>
+          <w:tcPr>
+            <w:tcW w:w="1100" w:type="dxa"/>
+          </w:tcPr>
+          <w:p>
+            <w:pPr>
+              <w:spacing w:after="0"/>
+            </w:pPr>
+            <w:r>
+              <w:rPr>
+                <w:rFonts w:ascii="Calibri" w:hAnsi="Calibri"/>
+                <w:sz w:val="16"/>
+              </w:rPr>
+              <w:t>15-10-2026</w:t>
+            </w:r>
+          </w:p>
+        </w:tc>
+        <w:tc>
+          <w:tcPr>
+            <w:tcW w:w="900" w:type="dxa"/>
+          </w:tcPr>
+          <w:p>
+            <w:pPr>
+              <w:spacing w:after="0"/>
+            </w:pPr>
+            <w:r>
+              <w:rPr>
+                <w:rFonts w:ascii="Calibri" w:hAnsi="Calibri"/>
+                <w:sz w:val="16"/>
+              </w:rPr>
+              <w:t>Sprint 02</w:t>
+            </w:r>
+          </w:p>
+        </w:tc>
+        <w:tc>
+          <w:tcPr>
+            <w:tcW w:w="900" w:type="dxa"/>
+          </w:tcPr>
+          <w:p>
+            <w:pPr>
+              <w:spacing w:after="0"/>
+            </w:pPr>
+            <w:r>
+              <w:rPr>
+                <w:rFonts w:ascii="Calibri" w:hAnsi="Calibri"/>
+                <w:sz w:val="16"/>
+              </w:rPr>
+              <w:t>PB-34, PB-35</w:t>
+            </w:r>
+          </w:p>
+        </w:tc>
+        <w:tc>
+          <w:tcPr>
+            <w:tcW w:w="3738" w:type="dxa"/>
+          </w:tcPr>
+          <w:p>
+            <w:pPr>
+              <w:spacing w:after="0"/>
+            </w:pPr>
+            <w:r>
+              <w:rPr>
+                <w:rFonts w:ascii="Calibri" w:hAnsi="Calibri"/>
+                <w:sz w:val="16"/>
+              </w:rPr>
+              <w:t>Al cerrar la aplicación durante una pausa abierta, una comprobación final podía volver a generar la transición de inicio antes del cierre. Se esperaba finalizar una sola pausa y una sola sesión, sin registros abiertos.</w:t>
+            </w:r>
+          </w:p>
+        </w:tc>
+        <w:tc>
+          <w:tcPr>
+            <w:tcW w:w="1300" w:type="dxa"/>
+          </w:tcPr>
+          <w:p>
+            <w:pPr>
+              <w:spacing w:after="0"/>
+            </w:pPr>
+            <w:r>
+              <w:rPr>
+                <w:rFonts w:ascii="Calibri" w:hAnsi="Calibri"/>
+                <w:sz w:val="16"/>
+              </w:rPr>
+              <w:t>Alta</w:t>
+            </w:r>
+          </w:p>
+        </w:tc>
+      </w:tr>
+      <w:tr>
+        <w:tc>
+          <w:tcPr>
+            <w:tcW w:w="900" w:type="dxa"/>
+          </w:tcPr>
+          <w:p>
+            <w:pPr>
+              <w:spacing w:after="0"/>
+            </w:pPr>
+            <w:r>
+              <w:rPr>
+                <w:rFonts w:ascii="Calibri" w:hAnsi="Calibri"/>
+                <w:sz w:val="16"/>
+              </w:rPr>
+              <w:t>ERR-002</w:t>
+            </w:r>
+          </w:p>
+        </w:tc>
+        <w:tc>
+          <w:tcPr>
+            <w:tcW w:w="1100" w:type="dxa"/>
+          </w:tcPr>
+          <w:p>
+            <w:pPr>
+              <w:spacing w:after="0"/>
+            </w:pPr>
+            <w:r>
+              <w:rPr>
+                <w:rFonts w:ascii="Calibri" w:hAnsi="Calibri"/>
+                <w:sz w:val="16"/>
+              </w:rPr>
+              <w:t>15-10-2026</w:t>
+            </w:r>
+          </w:p>
+        </w:tc>
+        <w:tc>
+          <w:tcPr>
+            <w:tcW w:w="900" w:type="dxa"/>
+          </w:tcPr>
+          <w:p>
+            <w:pPr>
+              <w:spacing w:after="0"/>
+            </w:pPr>
+            <w:r>
+              <w:rPr>
+                <w:rFonts w:ascii="Calibri" w:hAnsi="Calibri"/>
+                <w:sz w:val="16"/>
+              </w:rPr>
+              <w:t>Sprint 02</w:t>
+            </w:r>
+          </w:p>
+        </w:tc>
+        <w:tc>
+          <w:tcPr>
+            <w:tcW w:w="900" w:type="dxa"/>
+          </w:tcPr>
+          <w:p>
+            <w:pPr>
+              <w:spacing w:after="0"/>
+            </w:pPr>
+            <w:r>
+              <w:rPr>
+                <w:rFonts w:ascii="Calibri" w:hAnsi="Calibri"/>
+                <w:sz w:val="16"/>
+              </w:rPr>
+              <w:t>PB-48</w:t>
+            </w:r>
+          </w:p>
+        </w:tc>
+        <w:tc>
+          <w:tcPr>
+            <w:tcW w:w="3738" w:type="dxa"/>
+          </w:tcPr>
+          <w:p>
+            <w:pPr>
+              <w:spacing w:after="0"/>
+            </w:pPr>
+            <w:r>
+              <w:rPr>
+                <w:rFonts w:ascii="Calibri" w:hAnsi="Calibri"/>
+                <w:sz w:val="16"/>
+              </w:rPr>
+              <w:t>Si el servidor estaba temporalmente inaccesible al abrir la aplicación, la restauración eliminaba el refresh token válido. Se esperaba conservarlo ante errores de conexión y eliminarlo solo cuando el servidor rechazara el token.</w:t>
+            </w:r>
+          </w:p>
+        </w:tc>
+        <w:tc>
+          <w:tcPr>
+            <w:tcW w:w="1300" w:type="dxa"/>
+          </w:tcPr>
+          <w:p>
+            <w:pPr>
+              <w:spacing w:after="0"/>
+            </w:pPr>
+            <w:r>
+              <w:rPr>
+                <w:rFonts w:ascii="Calibri" w:hAnsi="Calibri"/>
+                <w:sz w:val="16"/>
+              </w:rPr>
+              <w:t>Alta</w:t>
+            </w:r>
+          </w:p>
+        </w:tc>
+      </w:tr>
     </w:tbl>
     <w:p>
       <w:pPr>
@@ -1802,7 +2297,7 @@
           <w:rFonts w:ascii="Calibri" w:hAnsi="Calibri" w:cs="Calibri"/>
         </w:rPr>
       </w:pPr>
-      <w:bookmarkStart w:id="5" w:name="_Toc9209106"/>
+      <w:bookmarkStart w:id="5" w:name="_Toc242959516"/>
       <w:r>
         <w:rPr>
           <w:rFonts w:ascii="Calibri" w:hAnsi="Calibri" w:cs="Calibri"/>
@@ -2019,6 +2514,214 @@
           </w:p>
         </w:tc>
       </w:tr>
+      <w:tr>
+        <w:tc>
+          <w:tcPr>
+            <w:tcW w:w="900" w:type="dxa"/>
+          </w:tcPr>
+          <w:p>
+            <w:pPr>
+              <w:spacing w:after="0"/>
+            </w:pPr>
+            <w:r>
+              <w:rPr>
+                <w:rFonts w:ascii="Calibri" w:hAnsi="Calibri"/>
+                <w:sz w:val="16"/>
+              </w:rPr>
+              <w:t>ERR-001</w:t>
+            </w:r>
+          </w:p>
+        </w:tc>
+        <w:tc>
+          <w:tcPr>
+            <w:tcW w:w="1600" w:type="dxa"/>
+          </w:tcPr>
+          <w:p>
+            <w:pPr>
+              <w:spacing w:after="0"/>
+            </w:pPr>
+            <w:r>
+              <w:rPr>
+                <w:rFonts w:ascii="Calibri" w:hAnsi="Calibri"/>
+                <w:sz w:val="16"/>
+              </w:rPr>
+              <w:t>Alejandro Silva</w:t>
+            </w:r>
+          </w:p>
+        </w:tc>
+        <w:tc>
+          <w:tcPr>
+            <w:tcW w:w="1300" w:type="dxa"/>
+          </w:tcPr>
+          <w:p>
+            <w:pPr>
+              <w:spacing w:after="0"/>
+            </w:pPr>
+            <w:r>
+              <w:rPr>
+                <w:rFonts w:ascii="Calibri" w:hAnsi="Calibri"/>
+                <w:sz w:val="16"/>
+              </w:rPr>
+              <w:t>Cerrado</w:t>
+            </w:r>
+          </w:p>
+        </w:tc>
+        <w:tc>
+          <w:tcPr>
+            <w:tcW w:w="2938" w:type="dxa"/>
+          </w:tcPr>
+          <w:p>
+            <w:pPr>
+              <w:spacing w:after="0"/>
+            </w:pPr>
+            <w:r>
+              <w:rPr>
+                <w:rFonts w:ascii="Calibri" w:hAnsi="Calibri"/>
+                <w:sz w:val="16"/>
+              </w:rPr>
+              <w:t>Se separó el cierre de recursos de la comprobación periódica. El controlador finaliza directamente la pausa y la sesión remotas de forma idempotente.</w:t>
+            </w:r>
+          </w:p>
+        </w:tc>
+        <w:tc>
+          <w:tcPr>
+            <w:tcW w:w="1000" w:type="dxa"/>
+          </w:tcPr>
+          <w:p>
+            <w:pPr>
+              <w:spacing w:after="0"/>
+            </w:pPr>
+            <w:r>
+              <w:rPr>
+                <w:rFonts w:ascii="Calibri" w:hAnsi="Calibri"/>
+                <w:sz w:val="16"/>
+              </w:rPr>
+              <w:t>Commit de cierre del Sprint 02</w:t>
+            </w:r>
+          </w:p>
+        </w:tc>
+        <w:tc>
+          <w:tcPr>
+            <w:tcW w:w="1100" w:type="dxa"/>
+          </w:tcPr>
+          <w:p>
+            <w:pPr>
+              <w:spacing w:after="0"/>
+            </w:pPr>
+            <w:r>
+              <w:rPr>
+                <w:rFonts w:ascii="Calibri" w:hAnsi="Calibri"/>
+                <w:sz w:val="16"/>
+              </w:rPr>
+              <w:t>15-10-2026</w:t>
+            </w:r>
+          </w:p>
+        </w:tc>
+      </w:tr>
+      <w:tr>
+        <w:tc>
+          <w:tcPr>
+            <w:tcW w:w="900" w:type="dxa"/>
+          </w:tcPr>
+          <w:p>
+            <w:pPr>
+              <w:spacing w:after="0"/>
+            </w:pPr>
+            <w:r>
+              <w:rPr>
+                <w:rFonts w:ascii="Calibri" w:hAnsi="Calibri"/>
+                <w:sz w:val="16"/>
+              </w:rPr>
+              <w:t>ERR-002</w:t>
+            </w:r>
+          </w:p>
+        </w:tc>
+        <w:tc>
+          <w:tcPr>
+            <w:tcW w:w="1600" w:type="dxa"/>
+          </w:tcPr>
+          <w:p>
+            <w:pPr>
+              <w:spacing w:after="0"/>
+            </w:pPr>
+            <w:r>
+              <w:rPr>
+                <w:rFonts w:ascii="Calibri" w:hAnsi="Calibri"/>
+                <w:sz w:val="16"/>
+              </w:rPr>
+              <w:t>Alejandro Silva</w:t>
+            </w:r>
+          </w:p>
+        </w:tc>
+        <w:tc>
+          <w:tcPr>
+            <w:tcW w:w="1300" w:type="dxa"/>
+          </w:tcPr>
+          <w:p>
+            <w:pPr>
+              <w:spacing w:after="0"/>
+            </w:pPr>
+            <w:r>
+              <w:rPr>
+                <w:rFonts w:ascii="Calibri" w:hAnsi="Calibri"/>
+                <w:sz w:val="16"/>
+              </w:rPr>
+              <w:t>Cerrado</w:t>
+            </w:r>
+          </w:p>
+        </w:tc>
+        <w:tc>
+          <w:tcPr>
+            <w:tcW w:w="2938" w:type="dxa"/>
+          </w:tcPr>
+          <w:p>
+            <w:pPr>
+              <w:spacing w:after="0"/>
+            </w:pPr>
+            <w:r>
+              <w:rPr>
+                <w:rFonts w:ascii="Calibri" w:hAnsi="Calibri"/>
+                <w:sz w:val="16"/>
+              </w:rPr>
+              <w:t>El cliente distingue errores de conexión de respuestas HTTP. Conserva el token si no existe respuesta y lo elimina únicamente ante un rechazo del servidor.</w:t>
+            </w:r>
+          </w:p>
+        </w:tc>
+        <w:tc>
+          <w:tcPr>
+            <w:tcW w:w="1000" w:type="dxa"/>
+          </w:tcPr>
+          <w:p>
+            <w:pPr>
+              <w:spacing w:after="0"/>
+            </w:pPr>
+            <w:r>
+              <w:rPr>
+                <w:rFonts w:ascii="Calibri" w:hAnsi="Calibri"/>
+                <w:sz w:val="16"/>
+              </w:rPr>
+              <w:t>Commit de cierre del Sprint 02</w:t>
+            </w:r>
+          </w:p>
+        </w:tc>
+        <w:tc>
+          <w:tcPr>
+            <w:tcW w:w="1100" w:type="dxa"/>
+          </w:tcPr>
+          <w:p>
+            <w:pPr>
+              <w:spacing w:after="0"/>
+            </w:pPr>
+            <w:r>
+              <w:rPr>
+                <w:rFonts w:ascii="Calibri" w:hAnsi="Calibri"/>
+                <w:sz w:val="16"/>
+              </w:rPr>
+              <w:t>15-10-2026</w:t>
+            </w:r>
+          </w:p>
+        </w:tc>
+      </w:tr>
     </w:tbl>
     <w:p>
       <w:pPr>
@@ -2038,7 +2741,7 @@
           <w:rFonts w:ascii="Calibri" w:hAnsi="Calibri" w:cs="Calibri"/>
         </w:rPr>
       </w:pPr>
-      <w:bookmarkStart w:id="6" w:name="_Toc9209107"/>
+      <w:bookmarkStart w:id="6" w:name="_Toc242959517"/>
       <w:r>
         <w:rPr>
           <w:rFonts w:ascii="Calibri" w:hAnsi="Calibri" w:cs="Calibri"/>
@@ -2114,6 +2817,7 @@
                 <w:sz w:val="22"/>
                 <w:szCs w:val="22"/>
               </w:rPr>
+              <w:lastRenderedPageBreak/>
               <w:t>Sprint</w:t>
             </w:r>
           </w:p>
@@ -2386,14 +3090,15 @@
           </w:tcPr>
           <w:p>
             <w:pPr>
-              <w:keepNext/>
-              <w:spacing w:after="40"/>
-              <w:rPr>
-                <w:rFonts w:ascii="Calibri" w:hAnsi="Calibri" w:cs="Calibri"/>
-                <w:sz w:val="22"/>
-                <w:szCs w:val="22"/>
-              </w:rPr>
-            </w:pPr>
+              <w:spacing w:after="0"/>
+            </w:pPr>
+            <w:r>
+              <w:rPr>
+                <w:rFonts w:ascii="Calibri" w:hAnsi="Calibri"/>
+                <w:sz w:val="18"/>
+              </w:rPr>
+              <w:t>2</w:t>
+            </w:r>
           </w:p>
         </w:tc>
         <w:tc>
@@ -2402,14 +3107,15 @@
           </w:tcPr>
           <w:p>
             <w:pPr>
-              <w:keepNext/>
-              <w:spacing w:after="40"/>
-              <w:rPr>
-                <w:rFonts w:ascii="Calibri" w:hAnsi="Calibri" w:cs="Calibri"/>
-                <w:sz w:val="22"/>
-                <w:szCs w:val="22"/>
-              </w:rPr>
-            </w:pPr>
+              <w:spacing w:after="0"/>
+            </w:pPr>
+            <w:r>
+              <w:rPr>
+                <w:rFonts w:ascii="Calibri" w:hAnsi="Calibri"/>
+                <w:sz w:val="18"/>
+              </w:rPr>
+              <w:t>2</w:t>
+            </w:r>
           </w:p>
         </w:tc>
         <w:tc>
@@ -2418,14 +3124,15 @@
           </w:tcPr>
           <w:p>
             <w:pPr>
-              <w:keepNext/>
-              <w:spacing w:after="40"/>
-              <w:rPr>
-                <w:rFonts w:ascii="Calibri" w:hAnsi="Calibri" w:cs="Calibri"/>
-                <w:sz w:val="22"/>
-                <w:szCs w:val="22"/>
-              </w:rPr>
-            </w:pPr>
+              <w:spacing w:after="0"/>
+            </w:pPr>
+            <w:r>
+              <w:rPr>
+                <w:rFonts w:ascii="Calibri" w:hAnsi="Calibri"/>
+                <w:sz w:val="18"/>
+              </w:rPr>
+              <w:t>0</w:t>
+            </w:r>
           </w:p>
         </w:tc>
         <w:tc>
@@ -2434,14 +3141,15 @@
           </w:tcPr>
           <w:p>
             <w:pPr>
-              <w:keepNext/>
-              <w:spacing w:after="40"/>
-              <w:rPr>
-                <w:rFonts w:ascii="Calibri" w:hAnsi="Calibri" w:cs="Calibri"/>
-                <w:sz w:val="22"/>
-                <w:szCs w:val="22"/>
-              </w:rPr>
-            </w:pPr>
+              <w:spacing w:after="0"/>
+            </w:pPr>
+            <w:r>
+              <w:rPr>
+                <w:rFonts w:ascii="Calibri" w:hAnsi="Calibri"/>
+                <w:sz w:val="18"/>
+              </w:rPr>
+              <w:t>0</w:t>
+            </w:r>
           </w:p>
         </w:tc>
       </w:tr>

</xml_diff>